<commit_message>
fixed cyfrowka project pdfs
</commit_message>
<xml_diff>
--- a/Semestr 4/Cyfrowka/lista_kontrolna_2026.docx
+++ b/Semestr 4/Cyfrowka/lista_kontrolna_2026.docx
@@ -20,7 +20,15 @@
         <w:t xml:space="preserve">: </w:t>
       </w:r>
       <w:r>
-        <w:t>12 Gauge Gamble</w:t>
+        <w:t xml:space="preserve">12 </w:t>
+      </w:r>
+      <w:proofErr w:type="spellStart"/>
+      <w:r>
+        <w:t>Gauge</w:t>
+      </w:r>
+      <w:proofErr w:type="spellEnd"/>
+      <w:r>
+        <w:t xml:space="preserve"> Gamble</w:t>
       </w:r>
     </w:p>
     <w:p>
@@ -75,7 +83,7 @@
           <w:rFonts w:hint="eastAsia"/>
           <w:noProof/>
         </w:rPr>
-        <w:t>30.08.2026</w:t>
+        <w:t>13.09.2026</w:t>
       </w:r>
       <w:r>
         <w:fldChar w:fldCharType="end"/>
@@ -338,6 +346,14 @@
                 <w:lang w:val="pl-PL"/>
               </w:rPr>
             </w:pPr>
+            <w:r>
+              <w:rPr>
+                <w:sz w:val="22"/>
+                <w:szCs w:val="22"/>
+                <w:lang w:val="pl-PL"/>
+              </w:rPr>
+              <w:t>TAK</w:t>
+            </w:r>
           </w:p>
         </w:tc>
       </w:tr>
@@ -382,6 +398,7 @@
               </w:rPr>
               <w:t xml:space="preserve">katalogu </w:t>
             </w:r>
+            <w:proofErr w:type="spellStart"/>
             <w:r>
               <w:rPr>
                 <w:i/>
@@ -392,13 +409,32 @@
               </w:rPr>
               <w:t>results</w:t>
             </w:r>
-            <w:r>
-              <w:rPr>
-                <w:sz w:val="22"/>
-                <w:szCs w:val="22"/>
-                <w:lang w:val="pl-PL"/>
-              </w:rPr>
-              <w:t xml:space="preserve"> został umieszczony bitstream? ( TAK / NIE )</w:t>
+            <w:proofErr w:type="spellEnd"/>
+            <w:r>
+              <w:rPr>
+                <w:sz w:val="22"/>
+                <w:szCs w:val="22"/>
+                <w:lang w:val="pl-PL"/>
+              </w:rPr>
+              <w:t xml:space="preserve"> został umieszczony </w:t>
+            </w:r>
+            <w:proofErr w:type="spellStart"/>
+            <w:r>
+              <w:rPr>
+                <w:sz w:val="22"/>
+                <w:szCs w:val="22"/>
+                <w:lang w:val="pl-PL"/>
+              </w:rPr>
+              <w:t>bitstream</w:t>
+            </w:r>
+            <w:proofErr w:type="spellEnd"/>
+            <w:r>
+              <w:rPr>
+                <w:sz w:val="22"/>
+                <w:szCs w:val="22"/>
+                <w:lang w:val="pl-PL"/>
+              </w:rPr>
+              <w:t>? ( TAK / NIE )</w:t>
             </w:r>
           </w:p>
         </w:tc>
@@ -462,6 +498,14 @@
                 <w:lang w:val="pl-PL"/>
               </w:rPr>
             </w:pPr>
+            <w:r>
+              <w:rPr>
+                <w:sz w:val="22"/>
+                <w:szCs w:val="22"/>
+                <w:lang w:val="pl-PL"/>
+              </w:rPr>
+              <w:t>TAK</w:t>
+            </w:r>
           </w:p>
         </w:tc>
       </w:tr>
@@ -560,6 +604,14 @@
                 <w:lang w:val="pl-PL"/>
               </w:rPr>
             </w:pPr>
+            <w:r>
+              <w:rPr>
+                <w:sz w:val="22"/>
+                <w:szCs w:val="22"/>
+                <w:lang w:val="pl-PL"/>
+              </w:rPr>
+              <w:t>TAK</w:t>
+            </w:r>
           </w:p>
         </w:tc>
       </w:tr>
@@ -642,7 +694,25 @@
                 <w:szCs w:val="22"/>
                 <w:lang w:val="pl-PL"/>
               </w:rPr>
-              <w:t>w nowym katalogu, uruchomienie symulacji i wygenerowanie bitstream'u? ( TAK / NIE )</w:t>
+              <w:t xml:space="preserve">w nowym katalogu, uruchomienie symulacji i wygenerowanie </w:t>
+            </w:r>
+            <w:proofErr w:type="spellStart"/>
+            <w:r>
+              <w:rPr>
+                <w:sz w:val="22"/>
+                <w:szCs w:val="22"/>
+                <w:lang w:val="pl-PL"/>
+              </w:rPr>
+              <w:t>bitstream'u</w:t>
+            </w:r>
+            <w:proofErr w:type="spellEnd"/>
+            <w:r>
+              <w:rPr>
+                <w:sz w:val="22"/>
+                <w:szCs w:val="22"/>
+                <w:lang w:val="pl-PL"/>
+              </w:rPr>
+              <w:t>? ( TAK / NIE )</w:t>
             </w:r>
           </w:p>
         </w:tc>
@@ -706,6 +776,14 @@
                 <w:lang w:val="pl-PL"/>
               </w:rPr>
             </w:pPr>
+            <w:r>
+              <w:rPr>
+                <w:sz w:val="22"/>
+                <w:szCs w:val="22"/>
+                <w:lang w:val="pl-PL"/>
+              </w:rPr>
+              <w:t>TAK</w:t>
+            </w:r>
           </w:p>
         </w:tc>
       </w:tr>
@@ -740,8 +818,18 @@
                 <w:szCs w:val="22"/>
                 <w:lang w:val="pl-PL"/>
               </w:rPr>
-              <w:t>Numer użytej wersji Vivado</w:t>
-            </w:r>
+              <w:t xml:space="preserve">Numer użytej wersji </w:t>
+            </w:r>
+            <w:proofErr w:type="spellStart"/>
+            <w:r>
+              <w:rPr>
+                <w:sz w:val="22"/>
+                <w:szCs w:val="22"/>
+                <w:lang w:val="pl-PL"/>
+              </w:rPr>
+              <w:t>Vivado</w:t>
+            </w:r>
+            <w:proofErr w:type="spellEnd"/>
           </w:p>
         </w:tc>
         <w:tc>
@@ -837,8 +925,18 @@
                 <w:szCs w:val="22"/>
                 <w:lang w:val="pl-PL"/>
               </w:rPr>
-              <w:t>Liczba błędów (error) zgłoszonych przez Vivado</w:t>
-            </w:r>
+              <w:t xml:space="preserve">Liczba błędów (error) zgłoszonych przez </w:t>
+            </w:r>
+            <w:proofErr w:type="spellStart"/>
+            <w:r>
+              <w:rPr>
+                <w:sz w:val="22"/>
+                <w:szCs w:val="22"/>
+                <w:lang w:val="pl-PL"/>
+              </w:rPr>
+              <w:t>Vivado</w:t>
+            </w:r>
+            <w:proofErr w:type="spellEnd"/>
           </w:p>
         </w:tc>
         <w:tc>
@@ -901,6 +999,14 @@
                 <w:lang w:val="pl-PL"/>
               </w:rPr>
             </w:pPr>
+            <w:r>
+              <w:rPr>
+                <w:sz w:val="22"/>
+                <w:szCs w:val="22"/>
+                <w:lang w:val="pl-PL"/>
+              </w:rPr>
+              <w:t>0</w:t>
+            </w:r>
           </w:p>
         </w:tc>
       </w:tr>
@@ -935,6 +1041,7 @@
               </w:rPr>
               <w:t>Liczba ostrzeżeń krytycznych (</w:t>
             </w:r>
+            <w:proofErr w:type="spellStart"/>
             <w:r>
               <w:rPr>
                 <w:i/>
@@ -943,16 +1050,49 @@
                 <w:szCs w:val="22"/>
                 <w:lang w:val="pl-PL"/>
               </w:rPr>
-              <w:t>critical warning</w:t>
-            </w:r>
-            <w:r>
-              <w:rPr>
-                <w:sz w:val="22"/>
-                <w:szCs w:val="22"/>
-                <w:lang w:val="pl-PL"/>
-              </w:rPr>
-              <w:t>) zgłoszona przez Vivado</w:t>
-            </w:r>
+              <w:t>critical</w:t>
+            </w:r>
+            <w:proofErr w:type="spellEnd"/>
+            <w:r>
+              <w:rPr>
+                <w:i/>
+                <w:iCs/>
+                <w:sz w:val="22"/>
+                <w:szCs w:val="22"/>
+                <w:lang w:val="pl-PL"/>
+              </w:rPr>
+              <w:t xml:space="preserve"> </w:t>
+            </w:r>
+            <w:proofErr w:type="spellStart"/>
+            <w:r>
+              <w:rPr>
+                <w:i/>
+                <w:iCs/>
+                <w:sz w:val="22"/>
+                <w:szCs w:val="22"/>
+                <w:lang w:val="pl-PL"/>
+              </w:rPr>
+              <w:t>warning</w:t>
+            </w:r>
+            <w:proofErr w:type="spellEnd"/>
+            <w:r>
+              <w:rPr>
+                <w:sz w:val="22"/>
+                <w:szCs w:val="22"/>
+                <w:lang w:val="pl-PL"/>
+              </w:rPr>
+              <w:t xml:space="preserve">) zgłoszona przez </w:t>
+            </w:r>
+            <w:proofErr w:type="spellStart"/>
+            <w:r>
+              <w:rPr>
+                <w:sz w:val="22"/>
+                <w:szCs w:val="22"/>
+                <w:lang w:val="pl-PL"/>
+              </w:rPr>
+              <w:t>Vivado</w:t>
+            </w:r>
+            <w:proofErr w:type="spellEnd"/>
           </w:p>
         </w:tc>
         <w:tc>
@@ -1015,6 +1155,14 @@
                 <w:lang w:val="pl-PL"/>
               </w:rPr>
             </w:pPr>
+            <w:r>
+              <w:rPr>
+                <w:sz w:val="22"/>
+                <w:szCs w:val="22"/>
+                <w:lang w:val="pl-PL"/>
+              </w:rPr>
+              <w:t>0</w:t>
+            </w:r>
           </w:p>
         </w:tc>
       </w:tr>
@@ -1049,6 +1197,7 @@
               </w:rPr>
               <w:t>Liczba ostrzeżeń zwykłych (</w:t>
             </w:r>
+            <w:proofErr w:type="spellStart"/>
             <w:r>
               <w:rPr>
                 <w:i/>
@@ -1059,14 +1208,25 @@
               </w:rPr>
               <w:t>warning</w:t>
             </w:r>
-            <w:r>
-              <w:rPr>
-                <w:sz w:val="22"/>
-                <w:szCs w:val="22"/>
-                <w:lang w:val="pl-PL"/>
-              </w:rPr>
-              <w:t>) zgłoszona przez Vivado</w:t>
-            </w:r>
+            <w:proofErr w:type="spellEnd"/>
+            <w:r>
+              <w:rPr>
+                <w:sz w:val="22"/>
+                <w:szCs w:val="22"/>
+                <w:lang w:val="pl-PL"/>
+              </w:rPr>
+              <w:t xml:space="preserve">) zgłoszona przez </w:t>
+            </w:r>
+            <w:proofErr w:type="spellStart"/>
+            <w:r>
+              <w:rPr>
+                <w:sz w:val="22"/>
+                <w:szCs w:val="22"/>
+                <w:lang w:val="pl-PL"/>
+              </w:rPr>
+              <w:t>Vivado</w:t>
+            </w:r>
+            <w:proofErr w:type="spellEnd"/>
           </w:p>
         </w:tc>
         <w:tc>
@@ -1120,6 +1280,14 @@
                 <w:lang w:val="pl-PL"/>
               </w:rPr>
             </w:pPr>
+            <w:r>
+              <w:rPr>
+                <w:sz w:val="22"/>
+                <w:szCs w:val="22"/>
+                <w:lang w:val="pl-PL"/>
+              </w:rPr>
+              <w:t>47</w:t>
+            </w:r>
           </w:p>
         </w:tc>
       </w:tr>
@@ -1209,6 +1377,14 @@
                 <w:lang w:val="pl-PL"/>
               </w:rPr>
             </w:pPr>
+            <w:r>
+              <w:rPr>
+                <w:sz w:val="22"/>
+                <w:szCs w:val="22"/>
+                <w:lang w:val="pl-PL"/>
+              </w:rPr>
+              <w:t>mysz</w:t>
+            </w:r>
           </w:p>
         </w:tc>
       </w:tr>
@@ -1307,6 +1483,14 @@
                 <w:lang w:val="pl-PL"/>
               </w:rPr>
             </w:pPr>
+            <w:r>
+              <w:rPr>
+                <w:sz w:val="22"/>
+                <w:szCs w:val="22"/>
+                <w:lang w:val="pl-PL"/>
+              </w:rPr>
+              <w:t>TAK</w:t>
+            </w:r>
           </w:p>
         </w:tc>
       </w:tr>
@@ -1341,7 +1525,43 @@
                 <w:szCs w:val="22"/>
                 <w:lang w:val="pl-PL"/>
               </w:rPr>
-              <w:t>Rozdzielczość ekranu ( X px / Y px )</w:t>
+              <w:t xml:space="preserve">Rozdzielczość ekranu ( X </w:t>
+            </w:r>
+            <w:proofErr w:type="spellStart"/>
+            <w:r>
+              <w:rPr>
+                <w:sz w:val="22"/>
+                <w:szCs w:val="22"/>
+                <w:lang w:val="pl-PL"/>
+              </w:rPr>
+              <w:t>px</w:t>
+            </w:r>
+            <w:proofErr w:type="spellEnd"/>
+            <w:r>
+              <w:rPr>
+                <w:sz w:val="22"/>
+                <w:szCs w:val="22"/>
+                <w:lang w:val="pl-PL"/>
+              </w:rPr>
+              <w:t xml:space="preserve"> / Y </w:t>
+            </w:r>
+            <w:proofErr w:type="spellStart"/>
+            <w:r>
+              <w:rPr>
+                <w:sz w:val="22"/>
+                <w:szCs w:val="22"/>
+                <w:lang w:val="pl-PL"/>
+              </w:rPr>
+              <w:t>px</w:t>
+            </w:r>
+            <w:proofErr w:type="spellEnd"/>
+            <w:r>
+              <w:rPr>
+                <w:sz w:val="22"/>
+                <w:szCs w:val="22"/>
+                <w:lang w:val="pl-PL"/>
+              </w:rPr>
+              <w:t xml:space="preserve"> )</w:t>
             </w:r>
           </w:p>
         </w:tc>
@@ -1396,6 +1616,14 @@
                 <w:lang w:val="pl-PL"/>
               </w:rPr>
             </w:pPr>
+            <w:r>
+              <w:rPr>
+                <w:sz w:val="22"/>
+                <w:szCs w:val="22"/>
+                <w:lang w:val="pl-PL"/>
+              </w:rPr>
+              <w:t>1024x768</w:t>
+            </w:r>
           </w:p>
         </w:tc>
       </w:tr>
@@ -1510,6 +1738,14 @@
                 <w:lang w:val="pl-PL"/>
               </w:rPr>
             </w:pPr>
+            <w:r>
+              <w:rPr>
+                <w:sz w:val="22"/>
+                <w:szCs w:val="22"/>
+                <w:lang w:val="pl-PL"/>
+              </w:rPr>
+              <w:t>TAK</w:t>
+            </w:r>
           </w:p>
         </w:tc>
       </w:tr>
@@ -1599,6 +1835,14 @@
                 <w:lang w:val="pl-PL"/>
               </w:rPr>
             </w:pPr>
+            <w:r>
+              <w:rPr>
+                <w:sz w:val="22"/>
+                <w:szCs w:val="22"/>
+                <w:lang w:val="pl-PL"/>
+              </w:rPr>
+              <w:t>BTNC</w:t>
+            </w:r>
           </w:p>
         </w:tc>
       </w:tr>
@@ -1633,7 +1877,25 @@
                 <w:szCs w:val="22"/>
                 <w:lang w:val="pl-PL"/>
               </w:rPr>
-              <w:t>Czy moduły używają wyłącznie sygnałów zegarowych generowanych przez bloki generatorów zegara (IP Vivado) ?  ( TAK / NIE )</w:t>
+              <w:t xml:space="preserve">Czy moduły używają wyłącznie sygnałów zegarowych generowanych przez bloki generatorów zegara (IP </w:t>
+            </w:r>
+            <w:proofErr w:type="spellStart"/>
+            <w:r>
+              <w:rPr>
+                <w:sz w:val="22"/>
+                <w:szCs w:val="22"/>
+                <w:lang w:val="pl-PL"/>
+              </w:rPr>
+              <w:t>Vivado</w:t>
+            </w:r>
+            <w:proofErr w:type="spellEnd"/>
+            <w:r>
+              <w:rPr>
+                <w:sz w:val="22"/>
+                <w:szCs w:val="22"/>
+                <w:lang w:val="pl-PL"/>
+              </w:rPr>
+              <w:t>) ?  ( TAK / NIE )</w:t>
             </w:r>
           </w:p>
         </w:tc>
@@ -1688,6 +1950,14 @@
                 <w:lang w:val="pl-PL"/>
               </w:rPr>
             </w:pPr>
+            <w:r>
+              <w:rPr>
+                <w:sz w:val="22"/>
+                <w:szCs w:val="22"/>
+                <w:lang w:val="pl-PL"/>
+              </w:rPr>
+              <w:t>TAK</w:t>
+            </w:r>
           </w:p>
         </w:tc>
       </w:tr>
@@ -1843,7 +2113,21 @@
         <w:rPr>
           <w:lang w:val="pl-PL"/>
         </w:rPr>
-        <w:t>, oceną z projektu będzie 2.0 (ndst).</w:t>
+        <w:t>, oceną z projektu będzie 2.0 (</w:t>
+      </w:r>
+      <w:proofErr w:type="spellStart"/>
+      <w:r>
+        <w:rPr>
+          <w:lang w:val="pl-PL"/>
+        </w:rPr>
+        <w:t>ndst</w:t>
+      </w:r>
+      <w:proofErr w:type="spellEnd"/>
+      <w:r>
+        <w:rPr>
+          <w:lang w:val="pl-PL"/>
+        </w:rPr>
+        <w:t>).</w:t>
       </w:r>
     </w:p>
     <w:sectPr>
@@ -1943,7 +2227,7 @@
         <w:rFonts w:hint="eastAsia"/>
         <w:noProof/>
       </w:rPr>
-      <w:t>30.08.2026</w:t>
+      <w:t>13.09.2026</w:t>
     </w:r>
     <w:r>
       <w:fldChar w:fldCharType="end"/>

</xml_diff>